<commit_message>
Add readability check script for QMD files
- Introduced a new script `readability_check.py` to analyze the readability of QMD files.
- The script processes files in the `cases` directory, stripping YAML front matter, code blocks, and other markup.
- It calculates various readability metrics including Flesch-Kincaid Grade, Gunning Fog Index, SMOG Index, and Flesch Reading Ease.
- Outputs word count, sentence count, average sentence length, and counts of headers, bullets, and numbered lists.
</commit_message>
<xml_diff>
--- a/docs/cases/02-tuskegee-guatemala.docx
+++ b/docs/cases/02-tuskegee-guatemala.docx
@@ -79,7 +79,7 @@
         <w:t xml:space="preserve"> </w:t>
       </w:r>
       <w:r>
-        <w:t xml:space="preserve">~600 Black men of Macon County, Alabama — 399 with latent syphilis, 201 uninfected controls — and, later, more than 1,300 Guatemalans deliberately infected by the same U.S. agency</w:t>
+        <w:t xml:space="preserve">About 600 Black men of Macon County, Alabama — 399 with latent syphilis, 201 uninfected controls — and, later, more than 1,300 Guatemalans deliberately infected by the same U.S. agency.</w:t>
       </w:r>
     </w:p>
     <w:p>
@@ -114,7 +114,7 @@
         <w:t xml:space="preserve">40 years (1932–1972)</w:t>
       </w:r>
       <w:r>
-        <w:t xml:space="preserve">, withholding penicillin and deceiving the men into believing they were being treated; a parallel PHS project in Guatemala (1946–1948) infected prisoners, soldiers, and psychiatric patients on purpose</w:t>
+        <w:t xml:space="preserve">. The agency withheld penicillin and deceived the men into believing they were being treated. A parallel PHS project in Guatemala (1946–1948) infected prisoners, soldiers, and psychiatric patients on purpose.</w:t>
       </w:r>
     </w:p>
     <w:p>
@@ -136,7 +136,7 @@
         <w:t xml:space="preserve"> </w:t>
       </w:r>
       <w:r>
-        <w:t xml:space="preserve">Tuskegee/Macon County, Alabama, 1932–1972; Guatemala, 1946–1948; exposed by a whistleblower and the press in 1972; the Guatemala records found in 2003</w:t>
+        <w:t xml:space="preserve">Tuskegee/Macon County, Alabama, 1932–1972; Guatemala, 1946–1948. Exposed by a whistleblower and the press in 1972. The Guatemala records were found in 2003.</w:t>
       </w:r>
     </w:p>
     <w:p>
@@ -224,7 +224,7 @@
         <w:pStyle w:val="FirstParagraph"/>
       </w:pPr>
       <w:r>
-        <w:t xml:space="preserve">In 1932 the United States Public Health Service (PHS) — the federal agency that would become the CDC — began what its own scientists titled the</w:t>
+        <w:t xml:space="preserve">In 1932, the United States Public Health Service (PHS) — the federal agency that would become the CDC — began what its own scientists titled the</w:t>
       </w:r>
       <w:r>
         <w:t xml:space="preserve"> </w:t>
@@ -237,7 +237,7 @@
         <w:t xml:space="preserve">Tuskegee Study of Untreated Syphilis in the Negro Male</w:t>
       </w:r>
       <w:r>
-        <w:t xml:space="preserve">. The premise was simple and, to its designers, scientifically attractive: find people with untreated</w:t>
+        <w:t xml:space="preserve">. The premise was simple. To its designers, it was scientifically attractive: find people with untreated</w:t>
       </w:r>
       <w:r>
         <w:t xml:space="preserve"> </w:t>
@@ -257,7 +257,39 @@
         <w:pStyle w:val="BodyText"/>
       </w:pPr>
       <w:r>
-        <w:t xml:space="preserve">They chose Macon County, Alabama, where most residents were Black, most were poor, and almost none had access to a doctor. That was the point. The men recruited — about 600, of whom 399 had latent syphilis and 201 served as healthy controls — were sharecroppers working white-owned land in a system of debt peonage. The PHS enlisted the respected Tuskegee Institute and a trusted Black public-health nurse, Eunice Rivers, whose constancy kept the men coming back for decades. The men were never told they had syphilis. They were told they had</w:t>
+        <w:t xml:space="preserve">They chose Macon County, Alabama. Most residents were Black. Most were poor. Almost none had access to a doctor. That was the point. The men recruited — about 600 in all — were sharecroppers working white-owned land in a system of debt peonage. Of the 600:</w:t>
+      </w:r>
+    </w:p>
+    <w:p>
+      <w:pPr>
+        <w:pStyle w:val="Compact"/>
+        <w:numPr>
+          <w:ilvl w:val="0"/>
+          <w:numId w:val="1002"/>
+        </w:numPr>
+      </w:pPr>
+      <w:r>
+        <w:t xml:space="preserve">399 had latent syphilis.</w:t>
+      </w:r>
+    </w:p>
+    <w:p>
+      <w:pPr>
+        <w:pStyle w:val="Compact"/>
+        <w:numPr>
+          <w:ilvl w:val="0"/>
+          <w:numId w:val="1002"/>
+        </w:numPr>
+      </w:pPr>
+      <w:r>
+        <w:t xml:space="preserve">201 served as healthy controls.</w:t>
+      </w:r>
+    </w:p>
+    <w:p>
+      <w:pPr>
+        <w:pStyle w:val="FirstParagraph"/>
+      </w:pPr>
+      <w:r>
+        <w:t xml:space="preserve">The PHS enlisted the respected Tuskegee Institute and a trusted Black public-health nurse, Eunice Rivers, whose constancy kept the men coming back for decades. The men were never told they had syphilis. They were told they had</w:t>
       </w:r>
       <w:r>
         <w:t xml:space="preserve"> </w:t>
@@ -333,7 +365,19 @@
         <w:pStyle w:val="BodyText"/>
       </w:pPr>
       <w:r>
-        <w:t xml:space="preserve">The deception was not passive. To collect the data they wanted, investigators performed painful diagnostic spinal taps and described them to the men as a special free</w:t>
+        <w:t xml:space="preserve">The deception was not passive. To collect the data they wanted, investigators did several specific things:</w:t>
+      </w:r>
+    </w:p>
+    <w:p>
+      <w:pPr>
+        <w:pStyle w:val="Compact"/>
+        <w:numPr>
+          <w:ilvl w:val="0"/>
+          <w:numId w:val="1003"/>
+        </w:numPr>
+      </w:pPr>
+      <w:r>
+        <w:t xml:space="preserve">They performed painful diagnostic spinal taps and called them a free</w:t>
       </w:r>
       <w:r>
         <w:t xml:space="preserve"> </w:t>
@@ -358,7 +402,19 @@
         <w:t xml:space="preserve">treatment</w:t>
       </w:r>
       <w:r>
-        <w:t xml:space="preserve">. One PHS officer wrote to colleagues that the men might refuse the procedure if they understood it was only diagnostic, so its real purpose should</w:t>
+        <w:t xml:space="preserve">.</w:t>
+      </w:r>
+    </w:p>
+    <w:p>
+      <w:pPr>
+        <w:pStyle w:val="Compact"/>
+        <w:numPr>
+          <w:ilvl w:val="0"/>
+          <w:numId w:val="1003"/>
+        </w:numPr>
+      </w:pPr>
+      <w:r>
+        <w:t xml:space="preserve">One PHS officer wrote that the men might refuse the procedure if they understood it was only diagnostic. Its real purpose, he said, should</w:t>
       </w:r>
       <w:r>
         <w:t xml:space="preserve"> </w:t>
@@ -366,11 +422,29 @@
       <w:r>
         <w:t xml:space="preserve">“be kept from them as far as possible.”</w:t>
       </w:r>
-      <w:r>
-        <w:t xml:space="preserve"> </w:t>
-      </w:r>
-      <w:r>
-        <w:t xml:space="preserve">Because the study’s final data point was the autopsy, the PHS offered burial insurance — a powerful inducement in a poor rural community where a proper funeral mattered — so that families would surrender the bodies. One investigator wrote that the team had</w:t>
+    </w:p>
+    <w:p>
+      <w:pPr>
+        <w:pStyle w:val="Compact"/>
+        <w:numPr>
+          <w:ilvl w:val="0"/>
+          <w:numId w:val="1003"/>
+        </w:numPr>
+      </w:pPr>
+      <w:r>
+        <w:t xml:space="preserve">Because the study’s final data point was the autopsy, the PHS offered burial insurance. This was a powerful inducement in a poor rural community where a proper funeral mattered. Families would surrender the bodies in return.</w:t>
+      </w:r>
+    </w:p>
+    <w:p>
+      <w:pPr>
+        <w:pStyle w:val="Compact"/>
+        <w:numPr>
+          <w:ilvl w:val="0"/>
+          <w:numId w:val="1003"/>
+        </w:numPr>
+      </w:pPr>
+      <w:r>
+        <w:t xml:space="preserve">One investigator wrote that the team had</w:t>
       </w:r>
       <w:r>
         <w:t xml:space="preserve"> </w:t>
@@ -378,9 +452,15 @@
       <w:r>
         <w:t xml:space="preserve">“no further interest in these patients until they die.”</w:t>
       </w:r>
-      <w:r>
-        <w:t xml:space="preserve"> </w:t>
-      </w:r>
+    </w:p>
+    <w:p>
+      <w:pPr>
+        <w:pStyle w:val="Compact"/>
+        <w:numPr>
+          <w:ilvl w:val="0"/>
+          <w:numId w:val="1003"/>
+        </w:numPr>
+      </w:pPr>
       <w:r>
         <w:t xml:space="preserve">When a mobile treatment unit later swept the county offering free penicillin to everyone, PHS staff quietly flagged their enrollees to local doctors with the instruction that the man was under study and</w:t>
       </w:r>
@@ -538,7 +618,7 @@
         <w:t xml:space="preserve"> </w:t>
       </w:r>
       <w:r>
-        <w:t xml:space="preserve">valuable, not less — a never-to-be-repeated chance to see the full natural course of a disease that would soon no longer run its course anywhere else. The study generated about fifteen papers in reputable medical journals over thirty-seven years. The titles alone announced what it was — one 1964 article was called</w:t>
+        <w:t xml:space="preserve">valuable, not less. It was a never-to-be-repeated chance to see the full natural course of a disease that would soon no longer run its course anywhere else. The study generated about fifteen papers in reputable medical journals over thirty-seven years. The titles alone announced what it was — one 1964 article was called</w:t>
       </w:r>
       <w:r>
         <w:t xml:space="preserve"> </w:t>
@@ -558,7 +638,51 @@
         <w:pStyle w:val="BodyText"/>
       </w:pPr>
       <w:r>
-        <w:t xml:space="preserve">It ended only because one PHS employee would not let it go. By the most-cited later reckonings, dozens of the men had died of syphilis or its complications, dozens of their wives had been infected, and children had been born with congenital syphilis. In 1973, after the story broke, a class-action suit produced an out-of-court settlement, and the government eventually provided lifetime medical care to survivors and affected families. In 1997 — a quarter century after the study stopped — President Clinton apologized: what the government did</w:t>
+        <w:t xml:space="preserve">It ended only because one PHS employee would not let it go. By the most-cited later reckonings:</w:t>
+      </w:r>
+    </w:p>
+    <w:p>
+      <w:pPr>
+        <w:pStyle w:val="Compact"/>
+        <w:numPr>
+          <w:ilvl w:val="0"/>
+          <w:numId w:val="1004"/>
+        </w:numPr>
+      </w:pPr>
+      <w:r>
+        <w:t xml:space="preserve">Dozens of the men had died of syphilis or its complications.</w:t>
+      </w:r>
+    </w:p>
+    <w:p>
+      <w:pPr>
+        <w:pStyle w:val="Compact"/>
+        <w:numPr>
+          <w:ilvl w:val="0"/>
+          <w:numId w:val="1004"/>
+        </w:numPr>
+      </w:pPr>
+      <w:r>
+        <w:t xml:space="preserve">Dozens of their wives had been infected.</w:t>
+      </w:r>
+    </w:p>
+    <w:p>
+      <w:pPr>
+        <w:pStyle w:val="Compact"/>
+        <w:numPr>
+          <w:ilvl w:val="0"/>
+          <w:numId w:val="1004"/>
+        </w:numPr>
+      </w:pPr>
+      <w:r>
+        <w:t xml:space="preserve">Children had been born with congenital syphilis.</w:t>
+      </w:r>
+    </w:p>
+    <w:p>
+      <w:pPr>
+        <w:pStyle w:val="FirstParagraph"/>
+      </w:pPr>
+      <w:r>
+        <w:t xml:space="preserve">In 1973, after the story broke, a class-action suit produced an out-of-court settlement. The government eventually provided lifetime medical care to survivors and affected families. In 1997 — a quarter century after the study stopped — President Clinton apologized: what the government did</w:t>
       </w:r>
       <w:r>
         <w:t xml:space="preserve"> </w:t>
@@ -654,24 +778,66 @@
         <w:pStyle w:val="FirstParagraph"/>
       </w:pPr>
       <w:r>
-        <w:t xml:space="preserve">The official lesson is institutional. Tuskegee, on this view, happened because the United States had no system requiring that subjects consent and no body to review research before it ran. So the country built one: the 1974 National Research Act,</w:t>
-      </w:r>
-      <w:r>
-        <w:t xml:space="preserve"> </w:t>
-      </w:r>
-      <w:r>
-        <w:t xml:space="preserve">institutional review boards</w:t>
-      </w:r>
-      <w:r>
-        <w:t xml:space="preserve"> </w:t>
-      </w:r>
-      <w:r>
-        <w:t xml:space="preserve">(IRBs) to approve and monitor studies, federal informed-consent regulations, and, in 1979, the Belmont Report’s three principles — respect for persons, beneficence, and justice.</w:t>
-      </w:r>
-    </w:p>
-    <w:p>
-      <w:pPr>
-        <w:pStyle w:val="BodyText"/>
+        <w:t xml:space="preserve">The official lesson is institutional. Tuskegee, on this view, happened because the United States had no system requiring that subjects consent and no body to review research before it ran. So the country built one:</w:t>
+      </w:r>
+    </w:p>
+    <w:p>
+      <w:pPr>
+        <w:pStyle w:val="Compact"/>
+        <w:numPr>
+          <w:ilvl w:val="0"/>
+          <w:numId w:val="1005"/>
+        </w:numPr>
+      </w:pPr>
+      <w:r>
+        <w:t xml:space="preserve">The 1974 National Research Act.</w:t>
+      </w:r>
+    </w:p>
+    <w:p>
+      <w:pPr>
+        <w:pStyle w:val="Compact"/>
+        <w:numPr>
+          <w:ilvl w:val="0"/>
+          <w:numId w:val="1005"/>
+        </w:numPr>
+      </w:pPr>
+      <w:r>
+        <w:t xml:space="preserve">Institutional review boards</w:t>
+      </w:r>
+      <w:r>
+        <w:t xml:space="preserve"> </w:t>
+      </w:r>
+      <w:r>
+        <w:t xml:space="preserve">(IRBs) to approve and monitor studies.</w:t>
+      </w:r>
+    </w:p>
+    <w:p>
+      <w:pPr>
+        <w:pStyle w:val="Compact"/>
+        <w:numPr>
+          <w:ilvl w:val="0"/>
+          <w:numId w:val="1005"/>
+        </w:numPr>
+      </w:pPr>
+      <w:r>
+        <w:t xml:space="preserve">Federal informed-consent regulations.</w:t>
+      </w:r>
+    </w:p>
+    <w:p>
+      <w:pPr>
+        <w:pStyle w:val="Compact"/>
+        <w:numPr>
+          <w:ilvl w:val="0"/>
+          <w:numId w:val="1005"/>
+        </w:numPr>
+      </w:pPr>
+      <w:r>
+        <w:t xml:space="preserve">In 1979, the Belmont Report’s three principles — respect for persons, beneficence, and justice.</w:t>
+      </w:r>
+    </w:p>
+    <w:p>
+      <w:pPr>
+        <w:pStyle w:val="FirstParagraph"/>
       </w:pPr>
       <w:r>
         <w:rPr>
@@ -718,7 +884,51 @@
         <w:t xml:space="preserve"> </w:t>
       </w:r>
       <w:r>
-        <w:t xml:space="preserve">distilled the post-Tuskegee consensus into three duties: respect persons as autonomous agents, do not harm and maximize benefit, and distribute research’s burdens and benefits fairly. These are the spine of every research-ethics rulebook in use today</w:t>
+        <w:t xml:space="preserve">distilled the post-Tuskegee consensus into three duties:</w:t>
+      </w:r>
+    </w:p>
+    <w:p>
+      <w:pPr>
+        <w:pStyle w:val="Compact"/>
+        <w:numPr>
+          <w:ilvl w:val="0"/>
+          <w:numId w:val="1006"/>
+        </w:numPr>
+      </w:pPr>
+      <w:r>
+        <w:t xml:space="preserve">Respect persons as autonomous agents.</w:t>
+      </w:r>
+    </w:p>
+    <w:p>
+      <w:pPr>
+        <w:pStyle w:val="Compact"/>
+        <w:numPr>
+          <w:ilvl w:val="0"/>
+          <w:numId w:val="1006"/>
+        </w:numPr>
+      </w:pPr>
+      <w:r>
+        <w:t xml:space="preserve">Do not harm and maximize benefit.</w:t>
+      </w:r>
+    </w:p>
+    <w:p>
+      <w:pPr>
+        <w:pStyle w:val="Compact"/>
+        <w:numPr>
+          <w:ilvl w:val="0"/>
+          <w:numId w:val="1006"/>
+        </w:numPr>
+      </w:pPr>
+      <w:r>
+        <w:t xml:space="preserve">Distribute research’s burdens and benefits fairly.</w:t>
+      </w:r>
+    </w:p>
+    <w:p>
+      <w:pPr>
+        <w:pStyle w:val="FirstParagraph"/>
+      </w:pPr>
+      <w:r>
+        <w:t xml:space="preserve">These are the spine of every research-ethics rulebook in use today</w:t>
       </w:r>
       <w:r>
         <w:t xml:space="preserve"> </w:t>
@@ -758,7 +968,7 @@
         <w:pStyle w:val="Compact"/>
         <w:numPr>
           <w:ilvl w:val="0"/>
-          <w:numId w:val="1002"/>
+          <w:numId w:val="1007"/>
         </w:numPr>
       </w:pPr>
       <w:r>
@@ -770,7 +980,7 @@
         <w:pStyle w:val="Compact"/>
         <w:numPr>
           <w:ilvl w:val="0"/>
-          <w:numId w:val="1002"/>
+          <w:numId w:val="1007"/>
         </w:numPr>
       </w:pPr>
       <w:r>
@@ -782,7 +992,7 @@
         <w:pStyle w:val="Compact"/>
         <w:numPr>
           <w:ilvl w:val="0"/>
-          <w:numId w:val="1002"/>
+          <w:numId w:val="1007"/>
         </w:numPr>
       </w:pPr>
       <w:r>
@@ -828,7 +1038,7 @@
         <w:pStyle w:val="FirstParagraph"/>
       </w:pPr>
       <w:r>
-        <w:t xml:space="preserve">The Nuremberg Code, written in 1947 after Nazi doctors were tried for experimenting on prisoners, opens with the sentence</w:t>
+        <w:t xml:space="preserve">The Nuremberg Code was written in 1947 after Nazi doctors were tried for experimenting on prisoners. It opens with the sentence</w:t>
       </w:r>
       <w:r>
         <w:t xml:space="preserve"> </w:t>
@@ -896,7 +1106,7 @@
         <w:t xml:space="preserve"> </w:t>
       </w:r>
       <w:r>
-        <w:t xml:space="preserve">more than 1,300 Guatemalans — prisoners, soldiers, and patients in a psychiatric hospital — with syphilis, gonorrhea, and chancroid, to test prevention. When infection through arranged contact proved unreliable, investigators inoculated subjects directly. At least eighty-three deaths were recorded. One psychiatric patient, after months of induced disease, was dying when a researcher infected her further; she died days later.</w:t>
+        <w:t xml:space="preserve">more than 1,300 Guatemalans — prisoners, soldiers, and patients in a psychiatric hospital — with syphilis, gonorrhea, and chancroid, to test prevention. When infection through arranged contact proved unreliable, investigators inoculated subjects directly. At least eighty-three deaths were recorded. One psychiatric patient, after months of induced disease, was dying when a researcher infected her further. She died days later.</w:t>
       </w:r>
     </w:p>
     <w:p>
@@ -904,7 +1114,43 @@
         <w:pStyle w:val="BodyText"/>
       </w:pPr>
       <w:r>
-        <w:t xml:space="preserve">The decisive fact about Guatemala is not its cruelty but its respectability. The principal investigator, John Mahoney, was arguably the most honored American physician-scientist of his day — he won a Lasker Award the year the experiments began. The proposal was reviewed and funded by an NIH study section staffed by physicians from the country’s leading medical schools. The Surgeon General was kept informed and enthusiastic; he is recorded remarking that</w:t>
+        <w:t xml:space="preserve">The decisive fact about Guatemala is not its cruelty but its respectability. Consider the chain of approval:</w:t>
+      </w:r>
+    </w:p>
+    <w:p>
+      <w:pPr>
+        <w:pStyle w:val="Compact"/>
+        <w:numPr>
+          <w:ilvl w:val="0"/>
+          <w:numId w:val="1008"/>
+        </w:numPr>
+      </w:pPr>
+      <w:r>
+        <w:t xml:space="preserve">The principal investigator, John Mahoney, was arguably the most honored American physician-scientist of his day. He won a Lasker Award the year the experiments began.</w:t>
+      </w:r>
+    </w:p>
+    <w:p>
+      <w:pPr>
+        <w:pStyle w:val="Compact"/>
+        <w:numPr>
+          <w:ilvl w:val="0"/>
+          <w:numId w:val="1008"/>
+        </w:numPr>
+      </w:pPr>
+      <w:r>
+        <w:t xml:space="preserve">The proposal was reviewed and funded by an NIH study section staffed by physicians from the country’s leading medical schools.</w:t>
+      </w:r>
+    </w:p>
+    <w:p>
+      <w:pPr>
+        <w:pStyle w:val="Compact"/>
+        <w:numPr>
+          <w:ilvl w:val="0"/>
+          <w:numId w:val="1008"/>
+        </w:numPr>
+      </w:pPr>
+      <w:r>
+        <w:t xml:space="preserve">The Surgeon General was kept informed and enthusiastic. He is recorded remarking that</w:t>
       </w:r>
       <w:r>
         <w:t xml:space="preserve"> </w:t>
@@ -912,9 +1158,11 @@
       <w:r>
         <w:t xml:space="preserve">“we couldn’t do such an experiment in this country.”</w:t>
       </w:r>
-      <w:r>
-        <w:t xml:space="preserve"> </w:t>
-      </w:r>
+    </w:p>
+    <w:p>
+      <w:pPr>
+        <w:pStyle w:val="FirstParagraph"/>
+      </w:pPr>
       <w:r>
         <w:t xml:space="preserve">Nothing failed in the chain of command. Everyone with authority approved.</w:t>
       </w:r>
@@ -1070,7 +1318,7 @@
         <w:pStyle w:val="Compact"/>
         <w:numPr>
           <w:ilvl w:val="0"/>
-          <w:numId w:val="1003"/>
+          <w:numId w:val="1009"/>
         </w:numPr>
       </w:pPr>
       <w:r>
@@ -1082,7 +1330,7 @@
         <w:pStyle w:val="Compact"/>
         <w:numPr>
           <w:ilvl w:val="0"/>
-          <w:numId w:val="1003"/>
+          <w:numId w:val="1009"/>
         </w:numPr>
       </w:pPr>
       <w:r>
@@ -1094,7 +1342,7 @@
         <w:pStyle w:val="Compact"/>
         <w:numPr>
           <w:ilvl w:val="0"/>
-          <w:numId w:val="1003"/>
+          <w:numId w:val="1009"/>
         </w:numPr>
       </w:pPr>
       <w:r>
@@ -1106,7 +1354,7 @@
         <w:pStyle w:val="FirstParagraph"/>
       </w:pPr>
       <w:r>
-        <w:t xml:space="preserve">That individual was Peter Buxtun. Hired by the PHS in 1965 as a venereal-disease interviewer in San Francisco, the Czech-born social worker — whose family had fled to America in 1937 — learned of the study from a coworker, obtained a folder of internal</w:t>
+        <w:t xml:space="preserve">That individual was Peter Buxtun. The PHS hired him in 1965 as a venereal-disease interviewer in San Francisco. He was a Czech-born social worker whose family had fled to America in 1937. He learned of the study from a coworker, obtained a folder of internal</w:t>
       </w:r>
       <w:r>
         <w:t xml:space="preserve"> </w:t>
@@ -1118,19 +1366,67 @@
         <w:t xml:space="preserve"> </w:t>
       </w:r>
       <w:r>
-        <w:t xml:space="preserve">reports, and recognized the shape of what he was reading. He had read the Nuremberg trial record. He filed formal objections in 1966 and again in 1968. The CDC summoned him to Atlanta and a senior official berated him. A blue-ribbon panel was convened in 1969; its dominant voice argued,</w:t>
-      </w:r>
-      <w:r>
-        <w:t xml:space="preserve"> </w:t>
-      </w:r>
-      <w:r>
-        <w:t xml:space="preserve">“You will never have another study like this; take advantage of it,”</w:t>
-      </w:r>
-      <w:r>
-        <w:t xml:space="preserve"> </w:t>
-      </w:r>
-      <w:r>
-        <w:t xml:space="preserve">and only one member, Gene Stollerman, urged that the men be treated as patients rather than as a data set. The panel voted to continue. Buxtun asked the CDC, in writing,</w:t>
+        <w:t xml:space="preserve">reports, and recognized the shape of what he was reading. He had read the Nuremberg trial record. His path inside the agency went like this:</w:t>
+      </w:r>
+    </w:p>
+    <w:p>
+      <w:pPr>
+        <w:pStyle w:val="Compact"/>
+        <w:numPr>
+          <w:ilvl w:val="0"/>
+          <w:numId w:val="1010"/>
+        </w:numPr>
+      </w:pPr>
+      <w:r>
+        <w:t xml:space="preserve">He filed formal objections in 1966 and again in 1968.</w:t>
+      </w:r>
+    </w:p>
+    <w:p>
+      <w:pPr>
+        <w:pStyle w:val="Compact"/>
+        <w:numPr>
+          <w:ilvl w:val="0"/>
+          <w:numId w:val="1010"/>
+        </w:numPr>
+      </w:pPr>
+      <w:r>
+        <w:t xml:space="preserve">The CDC summoned him to Atlanta, and a senior official berated him.</w:t>
+      </w:r>
+    </w:p>
+    <w:p>
+      <w:pPr>
+        <w:pStyle w:val="Compact"/>
+        <w:numPr>
+          <w:ilvl w:val="0"/>
+          <w:numId w:val="1010"/>
+        </w:numPr>
+      </w:pPr>
+      <w:r>
+        <w:t xml:space="preserve">A blue-ribbon panel was convened in 1969. Its dominant voice argued,</w:t>
+      </w:r>
+      <w:r>
+        <w:t xml:space="preserve"> </w:t>
+      </w:r>
+      <w:r>
+        <w:t xml:space="preserve">“You will never have another study like this; take advantage of it.”</w:t>
+      </w:r>
+      <w:r>
+        <w:t xml:space="preserve"> </w:t>
+      </w:r>
+      <w:r>
+        <w:t xml:space="preserve">Only one member, Gene Stollerman, urged that the men be treated as patients rather than as a data set.</w:t>
+      </w:r>
+    </w:p>
+    <w:p>
+      <w:pPr>
+        <w:pStyle w:val="Compact"/>
+        <w:numPr>
+          <w:ilvl w:val="0"/>
+          <w:numId w:val="1010"/>
+        </w:numPr>
+      </w:pPr>
+      <w:r>
+        <w:t xml:space="preserve">The panel voted to continue. Buxtun asked the CDC, in writing,</w:t>
       </w:r>
       <w:r>
         <w:t xml:space="preserve"> </w:t>
@@ -1142,7 +1438,19 @@
         <w:t xml:space="preserve"> </w:t>
       </w:r>
       <w:r>
-        <w:t xml:space="preserve">He received no answer. He took the documents to the press; the story broke in July 1972.</w:t>
+        <w:t xml:space="preserve">He received no answer.</w:t>
+      </w:r>
+    </w:p>
+    <w:p>
+      <w:pPr>
+        <w:pStyle w:val="Compact"/>
+        <w:numPr>
+          <w:ilvl w:val="0"/>
+          <w:numId w:val="1010"/>
+        </w:numPr>
+      </w:pPr>
+      <w:r>
+        <w:t xml:space="preserve">He took the documents to the press. The story broke in July 1972.</w:t>
       </w:r>
     </w:p>
     <w:tbl>
@@ -1269,7 +1577,7 @@
         <w:t xml:space="preserve"> </w:t>
       </w:r>
       <w:r>
-        <w:t xml:space="preserve">Stronger pressure to weave in here is from social psychology. Stanley Milgram’s obedience experiments — and a later study modeled on them in which university students were asked to recruit others into an obviously dangerous sham experiment — found that most people, given a legitimate-seeming authority, comply and look away, even when dissent is safe, anonymous, and easy</w:t>
+        <w:t xml:space="preserve">The stronger pressure to weave in here is from social psychology. Stanley Milgram’s obedience experiments — and a later study modeled on them, in which university students were asked to recruit others into an obviously dangerous sham experiment — found that most people, given a legitimate-seeming authority, comply and look away. They do this even when dissent is safe, anonymous, and easy</w:t>
       </w:r>
       <w:r>
         <w:t xml:space="preserve"> </w:t>
@@ -1298,7 +1606,7 @@
         <w:t xml:space="preserve">“agentic state”</w:t>
       </w:r>
       <w:r>
-        <w:t xml:space="preserve">: we recast ourselves as instruments of the authority and let our conscience go quiet. The Tuskegee physicians were not monsters by Milgram’s lights; they were ordinary people inside a structure that made silence feel normal.</w:t>
+        <w:t xml:space="preserve">: we recast ourselves as instruments of the authority and let our conscience go quiet. The Tuskegee physicians were not monsters by Milgram’s lights. They were ordinary people inside a structure that made silence feel normal.</w:t>
       </w:r>
     </w:p>
     <w:bookmarkEnd w:id="23"/>
@@ -1336,7 +1644,7 @@
         <w:pStyle w:val="Compact"/>
         <w:numPr>
           <w:ilvl w:val="0"/>
-          <w:numId w:val="1004"/>
+          <w:numId w:val="1011"/>
         </w:numPr>
       </w:pPr>
       <w:r>
@@ -1348,7 +1656,7 @@
         <w:pStyle w:val="Compact"/>
         <w:numPr>
           <w:ilvl w:val="0"/>
-          <w:numId w:val="1004"/>
+          <w:numId w:val="1011"/>
         </w:numPr>
       </w:pPr>
       <w:r>
@@ -1360,7 +1668,7 @@
         <w:pStyle w:val="Compact"/>
         <w:numPr>
           <w:ilvl w:val="0"/>
-          <w:numId w:val="1004"/>
+          <w:numId w:val="1011"/>
         </w:numPr>
       </w:pPr>
       <w:r>
@@ -1372,7 +1680,43 @@
         <w:pStyle w:val="FirstParagraph"/>
       </w:pPr>
       <w:r>
-        <w:t xml:space="preserve">The constructive half of this comes, again, from Milgram: obedience dropped sharply when the authority figure was made less imposing, when the victim was made more present, and — most powerfully — when</w:t>
+        <w:t xml:space="preserve">The constructive half of this comes, again, from Milgram. Obedience dropped sharply under three specific conditions:</w:t>
+      </w:r>
+    </w:p>
+    <w:p>
+      <w:pPr>
+        <w:pStyle w:val="Compact"/>
+        <w:numPr>
+          <w:ilvl w:val="0"/>
+          <w:numId w:val="1012"/>
+        </w:numPr>
+      </w:pPr>
+      <w:r>
+        <w:t xml:space="preserve">When the authority figure was made less imposing.</w:t>
+      </w:r>
+    </w:p>
+    <w:p>
+      <w:pPr>
+        <w:pStyle w:val="Compact"/>
+        <w:numPr>
+          <w:ilvl w:val="0"/>
+          <w:numId w:val="1012"/>
+        </w:numPr>
+      </w:pPr>
+      <w:r>
+        <w:t xml:space="preserve">When the victim was made more present.</w:t>
+      </w:r>
+    </w:p>
+    <w:p>
+      <w:pPr>
+        <w:pStyle w:val="Compact"/>
+        <w:numPr>
+          <w:ilvl w:val="0"/>
+          <w:numId w:val="1012"/>
+        </w:numPr>
+      </w:pPr>
+      <w:r>
+        <w:t xml:space="preserve">And — most powerfully — when</w:t>
       </w:r>
       <w:r>
         <w:t xml:space="preserve"> </w:t>
@@ -1388,7 +1732,71 @@
         <w:t xml:space="preserve"> </w:t>
       </w:r>
       <w:r>
-        <w:t xml:space="preserve">other person in the room dissented. The design implication is concrete: deflate the prestige of the lead researcher, make subjects visible rather than abstract, protect real (not cosmetic) channels for objection, and make it possible for objectors to find each other. The recurring real-world successes — the New Zealand</w:t>
+        <w:t xml:space="preserve">other person in the room dissented.</w:t>
+      </w:r>
+    </w:p>
+    <w:p>
+      <w:pPr>
+        <w:pStyle w:val="FirstParagraph"/>
+      </w:pPr>
+      <w:r>
+        <w:t xml:space="preserve">The design implication is concrete:</w:t>
+      </w:r>
+    </w:p>
+    <w:p>
+      <w:pPr>
+        <w:pStyle w:val="Compact"/>
+        <w:numPr>
+          <w:ilvl w:val="0"/>
+          <w:numId w:val="1013"/>
+        </w:numPr>
+      </w:pPr>
+      <w:r>
+        <w:t xml:space="preserve">Deflate the prestige of the lead researcher.</w:t>
+      </w:r>
+    </w:p>
+    <w:p>
+      <w:pPr>
+        <w:pStyle w:val="Compact"/>
+        <w:numPr>
+          <w:ilvl w:val="0"/>
+          <w:numId w:val="1013"/>
+        </w:numPr>
+      </w:pPr>
+      <w:r>
+        <w:t xml:space="preserve">Make subjects visible rather than abstract.</w:t>
+      </w:r>
+    </w:p>
+    <w:p>
+      <w:pPr>
+        <w:pStyle w:val="Compact"/>
+        <w:numPr>
+          <w:ilvl w:val="0"/>
+          <w:numId w:val="1013"/>
+        </w:numPr>
+      </w:pPr>
+      <w:r>
+        <w:t xml:space="preserve">Protect real (not cosmetic) channels for objection.</w:t>
+      </w:r>
+    </w:p>
+    <w:p>
+      <w:pPr>
+        <w:pStyle w:val="Compact"/>
+        <w:numPr>
+          <w:ilvl w:val="0"/>
+          <w:numId w:val="1013"/>
+        </w:numPr>
+      </w:pPr>
+      <w:r>
+        <w:t xml:space="preserve">Make it possible for objectors to find each other.</w:t>
+      </w:r>
+    </w:p>
+    <w:p>
+      <w:pPr>
+        <w:pStyle w:val="FirstParagraph"/>
+      </w:pPr>
+      <w:r>
+        <w:t xml:space="preserve">The recurring real-world successes — the New Zealand</w:t>
       </w:r>
       <w:r>
         <w:t xml:space="preserve"> </w:t>
@@ -1462,7 +1870,7 @@
         <w:t xml:space="preserve"> </w:t>
       </w:r>
       <w:r>
-        <w:t xml:space="preserve">they were poor, Black, unschooled, and without doctors — chosen for the very powerlessness that made them easy to deceive and unlikely to be believed. A PHS internal phrasing reduced them to a single compound label, a string of demographic adjectives ending in</w:t>
+        <w:t xml:space="preserve">they were poor, Black, unschooled, and without doctors. They were chosen for the very powerlessness that made them easy to deceive and unlikely to be believed. A PHS internal phrasing reduced them to a single compound label, a string of demographic adjectives ending in</w:t>
       </w:r>
       <w:r>
         <w:t xml:space="preserve"> </w:t>
@@ -1581,7 +1989,7 @@
         <w:t xml:space="preserve">fair subject selection</w:t>
       </w:r>
       <w:r>
-        <w:t xml:space="preserve">: research must not load its risks onto those least able to refuse, nor (the mirror error) exclude groups from research’s benefits. Tuskegee is the textbook case of wrongful</w:t>
+        <w:t xml:space="preserve">. Research must not load its risks onto those least able to refuse, nor (the mirror error) exclude groups from research’s benefits. Tuskegee is the textbook case of wrongful</w:t>
       </w:r>
       <w:r>
         <w:t xml:space="preserve"> </w:t>
@@ -1597,7 +2005,7 @@
         <w:t xml:space="preserve"> </w:t>
       </w:r>
       <w:r>
-        <w:t xml:space="preserve">of the vulnerable; modern ethics also watches for wrongful</w:t>
+        <w:t xml:space="preserve">of the vulnerable. Modern ethics also watches for wrongful</w:t>
       </w:r>
       <w:r>
         <w:t xml:space="preserve"> </w:t>
@@ -1630,7 +2038,7 @@
         <w:pStyle w:val="Compact"/>
         <w:numPr>
           <w:ilvl w:val="0"/>
-          <w:numId w:val="1005"/>
+          <w:numId w:val="1014"/>
         </w:numPr>
       </w:pPr>
       <w:r>
@@ -1642,7 +2050,7 @@
         <w:pStyle w:val="Compact"/>
         <w:numPr>
           <w:ilvl w:val="0"/>
-          <w:numId w:val="1005"/>
+          <w:numId w:val="1014"/>
         </w:numPr>
       </w:pPr>
       <w:r>
@@ -1654,7 +2062,7 @@
         <w:pStyle w:val="Compact"/>
         <w:numPr>
           <w:ilvl w:val="0"/>
-          <w:numId w:val="1005"/>
+          <w:numId w:val="1014"/>
         </w:numPr>
       </w:pPr>
       <w:r>
@@ -1666,7 +2074,63 @@
         <w:pStyle w:val="FirstParagraph"/>
       </w:pPr>
       <w:r>
-        <w:t xml:space="preserve">This is not safely historical. Research today still gravitates toward the institutionalized, the incarcerated, the cognitively impaired, and the poor — people under exactly Kipnis’s pressures — which is why</w:t>
+        <w:t xml:space="preserve">This is not safely historical. Research today still gravitates toward people under exactly Kipnis’s pressures:</w:t>
+      </w:r>
+    </w:p>
+    <w:p>
+      <w:pPr>
+        <w:pStyle w:val="Compact"/>
+        <w:numPr>
+          <w:ilvl w:val="0"/>
+          <w:numId w:val="1015"/>
+        </w:numPr>
+      </w:pPr>
+      <w:r>
+        <w:t xml:space="preserve">The institutionalized.</w:t>
+      </w:r>
+    </w:p>
+    <w:p>
+      <w:pPr>
+        <w:pStyle w:val="Compact"/>
+        <w:numPr>
+          <w:ilvl w:val="0"/>
+          <w:numId w:val="1015"/>
+        </w:numPr>
+      </w:pPr>
+      <w:r>
+        <w:t xml:space="preserve">The incarcerated.</w:t>
+      </w:r>
+    </w:p>
+    <w:p>
+      <w:pPr>
+        <w:pStyle w:val="Compact"/>
+        <w:numPr>
+          <w:ilvl w:val="0"/>
+          <w:numId w:val="1015"/>
+        </w:numPr>
+      </w:pPr>
+      <w:r>
+        <w:t xml:space="preserve">The cognitively impaired.</w:t>
+      </w:r>
+    </w:p>
+    <w:p>
+      <w:pPr>
+        <w:pStyle w:val="Compact"/>
+        <w:numPr>
+          <w:ilvl w:val="0"/>
+          <w:numId w:val="1015"/>
+        </w:numPr>
+      </w:pPr>
+      <w:r>
+        <w:t xml:space="preserve">The poor.</w:t>
+      </w:r>
+    </w:p>
+    <w:p>
+      <w:pPr>
+        <w:pStyle w:val="FirstParagraph"/>
+      </w:pPr>
+      <w:r>
+        <w:t xml:space="preserve">That is why</w:t>
       </w:r>
       <w:r>
         <w:t xml:space="preserve"> </w:t>
@@ -1712,7 +2176,7 @@
         <w:t xml:space="preserve"> </w:t>
       </w:r>
       <w:r>
-        <w:t xml:space="preserve">many Black Americans distrust medicine and research, so the remedy is outreach, apology, and education to repair the trust the study broke. After 1972 the empirical legacy is, in fact, measurable — Marcella Alsan and Marianne Wanamaker found that disclosure of the study was followed by reduced medical contact among older Black men and worse health outcomes, a real and lasting cost</w:t>
+        <w:t xml:space="preserve">many Black Americans distrust medicine and research, so the remedy is outreach, apology, and education to repair the trust the study broke. After 1972, the empirical legacy is, in fact, measurable. Marcella Alsan and Marianne Wanamaker found that disclosure of the study was followed by reduced medical contact among older Black men and worse health outcomes — a real and lasting cost</w:t>
       </w:r>
       <w:r>
         <w:t xml:space="preserve"> </w:t>
@@ -1740,7 +2204,7 @@
         <w:pStyle w:val="BodyText"/>
       </w:pPr>
       <w:r>
-        <w:t xml:space="preserve">But Vanessa Northington Gamble and Susan Reverby press a sharp objection to the standard account. Black medical distrust did not begin with Tuskegee and is not exhausted by it; it tracks a long history and, more importantly,</w:t>
+        <w:t xml:space="preserve">But Vanessa Northington Gamble and Susan Reverby press a sharp objection to the standard account. Black medical distrust did not begin with Tuskegee and is not exhausted by it. It tracks a long history and, more importantly,</w:t>
       </w:r>
       <w:r>
         <w:t xml:space="preserve"> </w:t>
@@ -1776,7 +2240,7 @@
         <w:t xml:space="preserve">)</w:t>
       </w:r>
       <w:r>
-        <w:t xml:space="preserve">. To explain today’s distrust by pointing only to a study that ended in 1972 can become a way of locating the problem safely in the past, and of casting Black patients as irrationally haunted rather than accurately observant. (Reverby also notes a precise irony: the Tuskegee men were not distrustful refusers — they</w:t>
+        <w:t xml:space="preserve">. To explain today’s distrust by pointing only to a study that ended in 1972 can become a way of locating the problem safely in the past. It can cast Black patients as irrationally haunted rather than accurately observant. (Reverby also notes a precise irony: the Tuskegee men were not distrustful refusers. They</w:t>
       </w:r>
       <w:r>
         <w:t xml:space="preserve"> </w:t>
@@ -1816,7 +2280,31 @@
         <w:t xml:space="preserve"> </w:t>
       </w:r>
       <w:r>
-        <w:t xml:space="preserve">— tended to land poorly, partly because it answered a question many Black patients were not asking. A review of equity strategies found that the interventions that raised uptake were structural and relational rather than rhetorical: vaccine sites placed inside trusted Black churches and barbershops, and outreach delivered by community health workers, clergy, and Black clinicians rather than by the institutions themselves</w:t>
+        <w:t xml:space="preserve">— tended to land poorly. It answered a question many Black patients were not asking. A review of equity strategies found that the interventions that raised uptake were structural and relational rather than rhetorical:</w:t>
+      </w:r>
+    </w:p>
+    <w:p>
+      <w:pPr>
+        <w:pStyle w:val="Compact"/>
+        <w:numPr>
+          <w:ilvl w:val="0"/>
+          <w:numId w:val="1016"/>
+        </w:numPr>
+      </w:pPr>
+      <w:r>
+        <w:t xml:space="preserve">Vaccine sites placed inside trusted Black churches and barbershops.</w:t>
+      </w:r>
+    </w:p>
+    <w:p>
+      <w:pPr>
+        <w:pStyle w:val="Compact"/>
+        <w:numPr>
+          <w:ilvl w:val="0"/>
+          <w:numId w:val="1016"/>
+        </w:numPr>
+      </w:pPr>
+      <w:r>
+        <w:t xml:space="preserve">Outreach delivered by community health workers, clergy, and Black clinicians rather than by the institutions themselves</w:t>
       </w:r>
       <w:r>
         <w:t xml:space="preserve"> </w:t>
@@ -1836,7 +2324,15 @@
         <w:t xml:space="preserve">)</w:t>
       </w:r>
       <w:r>
-        <w:t xml:space="preserve">. The recurring mechanism is</w:t>
+        <w:t xml:space="preserve">.</w:t>
+      </w:r>
+    </w:p>
+    <w:p>
+      <w:pPr>
+        <w:pStyle w:val="FirstParagraph"/>
+      </w:pPr>
+      <w:r>
+        <w:t xml:space="preserve">The recurring mechanism is</w:t>
       </w:r>
       <w:r>
         <w:t xml:space="preserve"> </w:t>
@@ -1880,7 +2376,7 @@
         <w:pStyle w:val="BodyText"/>
       </w:pPr>
       <w:r>
-        <w:t xml:space="preserve">That gives a clinician something to do rather than something to recite. It does not, however, settle the argument — it arguably concedes the critique’s premise (trust follows present conditions, not historical correction) while leaving the standard view’s strongest reply intact: history is</w:t>
+        <w:t xml:space="preserve">That gives a clinician something to do rather than something to recite. It does not, however, settle the argument. It arguably concedes the critique’s premise — trust follows present conditions, not historical correction — while leaving the standard view’s strongest reply intact: history is</w:t>
       </w:r>
       <w:r>
         <w:t xml:space="preserve"> </w:t>
@@ -1936,7 +2432,7 @@
         <w:pStyle w:val="Compact"/>
         <w:numPr>
           <w:ilvl w:val="0"/>
-          <w:numId w:val="1006"/>
+          <w:numId w:val="1017"/>
         </w:numPr>
       </w:pPr>
       <w:r>
@@ -1948,7 +2444,7 @@
         <w:pStyle w:val="Compact"/>
         <w:numPr>
           <w:ilvl w:val="0"/>
-          <w:numId w:val="1006"/>
+          <w:numId w:val="1017"/>
         </w:numPr>
       </w:pPr>
       <w:r>
@@ -1960,7 +2456,7 @@
         <w:pStyle w:val="Compact"/>
         <w:numPr>
           <w:ilvl w:val="0"/>
-          <w:numId w:val="1006"/>
+          <w:numId w:val="1017"/>
         </w:numPr>
       </w:pPr>
       <w:r>
@@ -1990,7 +2486,7 @@
       <w:pPr>
         <w:numPr>
           <w:ilvl w:val="0"/>
-          <w:numId w:val="1007"/>
+          <w:numId w:val="1018"/>
         </w:numPr>
       </w:pPr>
       <w:r>
@@ -2033,7 +2529,7 @@
       <w:pPr>
         <w:numPr>
           <w:ilvl w:val="0"/>
-          <w:numId w:val="1007"/>
+          <w:numId w:val="1018"/>
         </w:numPr>
       </w:pPr>
       <w:r>
@@ -2056,7 +2552,7 @@
       <w:pPr>
         <w:numPr>
           <w:ilvl w:val="0"/>
-          <w:numId w:val="1007"/>
+          <w:numId w:val="1018"/>
         </w:numPr>
       </w:pPr>
       <w:r>
@@ -2109,7 +2605,7 @@
       <w:pPr>
         <w:numPr>
           <w:ilvl w:val="0"/>
-          <w:numId w:val="1007"/>
+          <w:numId w:val="1018"/>
         </w:numPr>
       </w:pPr>
       <w:r>
@@ -2130,7 +2626,7 @@
       <w:pPr>
         <w:numPr>
           <w:ilvl w:val="0"/>
-          <w:numId w:val="1007"/>
+          <w:numId w:val="1018"/>
         </w:numPr>
       </w:pPr>
       <w:r>
@@ -2178,7 +2674,7 @@
         <w:pStyle w:val="Compact"/>
         <w:numPr>
           <w:ilvl w:val="0"/>
-          <w:numId w:val="1008"/>
+          <w:numId w:val="1019"/>
         </w:numPr>
       </w:pPr>
       <w:r>
@@ -2229,7 +2725,7 @@
         <w:pStyle w:val="Compact"/>
         <w:numPr>
           <w:ilvl w:val="0"/>
-          <w:numId w:val="1008"/>
+          <w:numId w:val="1019"/>
         </w:numPr>
       </w:pPr>
       <w:r>
@@ -2277,7 +2773,7 @@
         <w:pStyle w:val="Compact"/>
         <w:numPr>
           <w:ilvl w:val="0"/>
-          <w:numId w:val="1008"/>
+          <w:numId w:val="1019"/>
         </w:numPr>
       </w:pPr>
       <w:r>
@@ -2328,7 +2824,7 @@
         <w:pStyle w:val="Compact"/>
         <w:numPr>
           <w:ilvl w:val="0"/>
-          <w:numId w:val="1008"/>
+          <w:numId w:val="1019"/>
         </w:numPr>
       </w:pPr>
       <w:r>
@@ -2385,7 +2881,7 @@
         <w:pStyle w:val="Compact"/>
         <w:numPr>
           <w:ilvl w:val="0"/>
-          <w:numId w:val="1008"/>
+          <w:numId w:val="1019"/>
         </w:numPr>
       </w:pPr>
       <w:r>
@@ -3553,124 +4049,16 @@
     <w:abstractNumId w:val="991"/>
   </w:num>
   <w:num w:numId="1002">
-    <w:abstractNumId w:val="99411"/>
-    <w:lvlOverride w:ilvl="0">
-      <w:startOverride w:val="1"/>
-    </w:lvlOverride>
-    <w:lvlOverride w:ilvl="1">
-      <w:startOverride w:val="1"/>
-    </w:lvlOverride>
-    <w:lvlOverride w:ilvl="2">
-      <w:startOverride w:val="1"/>
-    </w:lvlOverride>
-    <w:lvlOverride w:ilvl="3">
-      <w:startOverride w:val="1"/>
-    </w:lvlOverride>
-    <w:lvlOverride w:ilvl="4">
-      <w:startOverride w:val="1"/>
-    </w:lvlOverride>
-    <w:lvlOverride w:ilvl="5">
-      <w:startOverride w:val="1"/>
-    </w:lvlOverride>
-    <w:lvlOverride w:ilvl="6">
-      <w:startOverride w:val="1"/>
-    </w:lvlOverride>
-    <w:lvlOverride w:ilvl="7">
-      <w:startOverride w:val="1"/>
-    </w:lvlOverride>
-    <w:lvlOverride w:ilvl="8">
-      <w:startOverride w:val="1"/>
-    </w:lvlOverride>
+    <w:abstractNumId w:val="991"/>
   </w:num>
   <w:num w:numId="1003">
-    <w:abstractNumId w:val="99411"/>
-    <w:lvlOverride w:ilvl="0">
-      <w:startOverride w:val="1"/>
-    </w:lvlOverride>
-    <w:lvlOverride w:ilvl="1">
-      <w:startOverride w:val="1"/>
-    </w:lvlOverride>
-    <w:lvlOverride w:ilvl="2">
-      <w:startOverride w:val="1"/>
-    </w:lvlOverride>
-    <w:lvlOverride w:ilvl="3">
-      <w:startOverride w:val="1"/>
-    </w:lvlOverride>
-    <w:lvlOverride w:ilvl="4">
-      <w:startOverride w:val="1"/>
-    </w:lvlOverride>
-    <w:lvlOverride w:ilvl="5">
-      <w:startOverride w:val="1"/>
-    </w:lvlOverride>
-    <w:lvlOverride w:ilvl="6">
-      <w:startOverride w:val="1"/>
-    </w:lvlOverride>
-    <w:lvlOverride w:ilvl="7">
-      <w:startOverride w:val="1"/>
-    </w:lvlOverride>
-    <w:lvlOverride w:ilvl="8">
-      <w:startOverride w:val="1"/>
-    </w:lvlOverride>
+    <w:abstractNumId w:val="991"/>
   </w:num>
   <w:num w:numId="1004">
-    <w:abstractNumId w:val="99411"/>
-    <w:lvlOverride w:ilvl="0">
-      <w:startOverride w:val="1"/>
-    </w:lvlOverride>
-    <w:lvlOverride w:ilvl="1">
-      <w:startOverride w:val="1"/>
-    </w:lvlOverride>
-    <w:lvlOverride w:ilvl="2">
-      <w:startOverride w:val="1"/>
-    </w:lvlOverride>
-    <w:lvlOverride w:ilvl="3">
-      <w:startOverride w:val="1"/>
-    </w:lvlOverride>
-    <w:lvlOverride w:ilvl="4">
-      <w:startOverride w:val="1"/>
-    </w:lvlOverride>
-    <w:lvlOverride w:ilvl="5">
-      <w:startOverride w:val="1"/>
-    </w:lvlOverride>
-    <w:lvlOverride w:ilvl="6">
-      <w:startOverride w:val="1"/>
-    </w:lvlOverride>
-    <w:lvlOverride w:ilvl="7">
-      <w:startOverride w:val="1"/>
-    </w:lvlOverride>
-    <w:lvlOverride w:ilvl="8">
-      <w:startOverride w:val="1"/>
-    </w:lvlOverride>
+    <w:abstractNumId w:val="991"/>
   </w:num>
   <w:num w:numId="1005">
-    <w:abstractNumId w:val="99411"/>
-    <w:lvlOverride w:ilvl="0">
-      <w:startOverride w:val="1"/>
-    </w:lvlOverride>
-    <w:lvlOverride w:ilvl="1">
-      <w:startOverride w:val="1"/>
-    </w:lvlOverride>
-    <w:lvlOverride w:ilvl="2">
-      <w:startOverride w:val="1"/>
-    </w:lvlOverride>
-    <w:lvlOverride w:ilvl="3">
-      <w:startOverride w:val="1"/>
-    </w:lvlOverride>
-    <w:lvlOverride w:ilvl="4">
-      <w:startOverride w:val="1"/>
-    </w:lvlOverride>
-    <w:lvlOverride w:ilvl="5">
-      <w:startOverride w:val="1"/>
-    </w:lvlOverride>
-    <w:lvlOverride w:ilvl="6">
-      <w:startOverride w:val="1"/>
-    </w:lvlOverride>
-    <w:lvlOverride w:ilvl="7">
-      <w:startOverride w:val="1"/>
-    </w:lvlOverride>
-    <w:lvlOverride w:ilvl="8">
-      <w:startOverride w:val="1"/>
-    </w:lvlOverride>
+    <w:abstractNumId w:val="991"/>
   </w:num>
   <w:num w:numId="1006">
     <w:abstractNumId w:val="99411"/>
@@ -3733,6 +4121,228 @@
     </w:lvlOverride>
   </w:num>
   <w:num w:numId="1008">
+    <w:abstractNumId w:val="991"/>
+  </w:num>
+  <w:num w:numId="1009">
+    <w:abstractNumId w:val="99411"/>
+    <w:lvlOverride w:ilvl="0">
+      <w:startOverride w:val="1"/>
+    </w:lvlOverride>
+    <w:lvlOverride w:ilvl="1">
+      <w:startOverride w:val="1"/>
+    </w:lvlOverride>
+    <w:lvlOverride w:ilvl="2">
+      <w:startOverride w:val="1"/>
+    </w:lvlOverride>
+    <w:lvlOverride w:ilvl="3">
+      <w:startOverride w:val="1"/>
+    </w:lvlOverride>
+    <w:lvlOverride w:ilvl="4">
+      <w:startOverride w:val="1"/>
+    </w:lvlOverride>
+    <w:lvlOverride w:ilvl="5">
+      <w:startOverride w:val="1"/>
+    </w:lvlOverride>
+    <w:lvlOverride w:ilvl="6">
+      <w:startOverride w:val="1"/>
+    </w:lvlOverride>
+    <w:lvlOverride w:ilvl="7">
+      <w:startOverride w:val="1"/>
+    </w:lvlOverride>
+    <w:lvlOverride w:ilvl="8">
+      <w:startOverride w:val="1"/>
+    </w:lvlOverride>
+  </w:num>
+  <w:num w:numId="1010">
+    <w:abstractNumId w:val="99411"/>
+    <w:lvlOverride w:ilvl="0">
+      <w:startOverride w:val="1"/>
+    </w:lvlOverride>
+    <w:lvlOverride w:ilvl="1">
+      <w:startOverride w:val="1"/>
+    </w:lvlOverride>
+    <w:lvlOverride w:ilvl="2">
+      <w:startOverride w:val="1"/>
+    </w:lvlOverride>
+    <w:lvlOverride w:ilvl="3">
+      <w:startOverride w:val="1"/>
+    </w:lvlOverride>
+    <w:lvlOverride w:ilvl="4">
+      <w:startOverride w:val="1"/>
+    </w:lvlOverride>
+    <w:lvlOverride w:ilvl="5">
+      <w:startOverride w:val="1"/>
+    </w:lvlOverride>
+    <w:lvlOverride w:ilvl="6">
+      <w:startOverride w:val="1"/>
+    </w:lvlOverride>
+    <w:lvlOverride w:ilvl="7">
+      <w:startOverride w:val="1"/>
+    </w:lvlOverride>
+    <w:lvlOverride w:ilvl="8">
+      <w:startOverride w:val="1"/>
+    </w:lvlOverride>
+  </w:num>
+  <w:num w:numId="1011">
+    <w:abstractNumId w:val="99411"/>
+    <w:lvlOverride w:ilvl="0">
+      <w:startOverride w:val="1"/>
+    </w:lvlOverride>
+    <w:lvlOverride w:ilvl="1">
+      <w:startOverride w:val="1"/>
+    </w:lvlOverride>
+    <w:lvlOverride w:ilvl="2">
+      <w:startOverride w:val="1"/>
+    </w:lvlOverride>
+    <w:lvlOverride w:ilvl="3">
+      <w:startOverride w:val="1"/>
+    </w:lvlOverride>
+    <w:lvlOverride w:ilvl="4">
+      <w:startOverride w:val="1"/>
+    </w:lvlOverride>
+    <w:lvlOverride w:ilvl="5">
+      <w:startOverride w:val="1"/>
+    </w:lvlOverride>
+    <w:lvlOverride w:ilvl="6">
+      <w:startOverride w:val="1"/>
+    </w:lvlOverride>
+    <w:lvlOverride w:ilvl="7">
+      <w:startOverride w:val="1"/>
+    </w:lvlOverride>
+    <w:lvlOverride w:ilvl="8">
+      <w:startOverride w:val="1"/>
+    </w:lvlOverride>
+  </w:num>
+  <w:num w:numId="1012">
+    <w:abstractNumId w:val="991"/>
+  </w:num>
+  <w:num w:numId="1013">
+    <w:abstractNumId w:val="99411"/>
+    <w:lvlOverride w:ilvl="0">
+      <w:startOverride w:val="1"/>
+    </w:lvlOverride>
+    <w:lvlOverride w:ilvl="1">
+      <w:startOverride w:val="1"/>
+    </w:lvlOverride>
+    <w:lvlOverride w:ilvl="2">
+      <w:startOverride w:val="1"/>
+    </w:lvlOverride>
+    <w:lvlOverride w:ilvl="3">
+      <w:startOverride w:val="1"/>
+    </w:lvlOverride>
+    <w:lvlOverride w:ilvl="4">
+      <w:startOverride w:val="1"/>
+    </w:lvlOverride>
+    <w:lvlOverride w:ilvl="5">
+      <w:startOverride w:val="1"/>
+    </w:lvlOverride>
+    <w:lvlOverride w:ilvl="6">
+      <w:startOverride w:val="1"/>
+    </w:lvlOverride>
+    <w:lvlOverride w:ilvl="7">
+      <w:startOverride w:val="1"/>
+    </w:lvlOverride>
+    <w:lvlOverride w:ilvl="8">
+      <w:startOverride w:val="1"/>
+    </w:lvlOverride>
+  </w:num>
+  <w:num w:numId="1014">
+    <w:abstractNumId w:val="99411"/>
+    <w:lvlOverride w:ilvl="0">
+      <w:startOverride w:val="1"/>
+    </w:lvlOverride>
+    <w:lvlOverride w:ilvl="1">
+      <w:startOverride w:val="1"/>
+    </w:lvlOverride>
+    <w:lvlOverride w:ilvl="2">
+      <w:startOverride w:val="1"/>
+    </w:lvlOverride>
+    <w:lvlOverride w:ilvl="3">
+      <w:startOverride w:val="1"/>
+    </w:lvlOverride>
+    <w:lvlOverride w:ilvl="4">
+      <w:startOverride w:val="1"/>
+    </w:lvlOverride>
+    <w:lvlOverride w:ilvl="5">
+      <w:startOverride w:val="1"/>
+    </w:lvlOverride>
+    <w:lvlOverride w:ilvl="6">
+      <w:startOverride w:val="1"/>
+    </w:lvlOverride>
+    <w:lvlOverride w:ilvl="7">
+      <w:startOverride w:val="1"/>
+    </w:lvlOverride>
+    <w:lvlOverride w:ilvl="8">
+      <w:startOverride w:val="1"/>
+    </w:lvlOverride>
+  </w:num>
+  <w:num w:numId="1015">
+    <w:abstractNumId w:val="991"/>
+  </w:num>
+  <w:num w:numId="1016">
+    <w:abstractNumId w:val="991"/>
+  </w:num>
+  <w:num w:numId="1017">
+    <w:abstractNumId w:val="99411"/>
+    <w:lvlOverride w:ilvl="0">
+      <w:startOverride w:val="1"/>
+    </w:lvlOverride>
+    <w:lvlOverride w:ilvl="1">
+      <w:startOverride w:val="1"/>
+    </w:lvlOverride>
+    <w:lvlOverride w:ilvl="2">
+      <w:startOverride w:val="1"/>
+    </w:lvlOverride>
+    <w:lvlOverride w:ilvl="3">
+      <w:startOverride w:val="1"/>
+    </w:lvlOverride>
+    <w:lvlOverride w:ilvl="4">
+      <w:startOverride w:val="1"/>
+    </w:lvlOverride>
+    <w:lvlOverride w:ilvl="5">
+      <w:startOverride w:val="1"/>
+    </w:lvlOverride>
+    <w:lvlOverride w:ilvl="6">
+      <w:startOverride w:val="1"/>
+    </w:lvlOverride>
+    <w:lvlOverride w:ilvl="7">
+      <w:startOverride w:val="1"/>
+    </w:lvlOverride>
+    <w:lvlOverride w:ilvl="8">
+      <w:startOverride w:val="1"/>
+    </w:lvlOverride>
+  </w:num>
+  <w:num w:numId="1018">
+    <w:abstractNumId w:val="99411"/>
+    <w:lvlOverride w:ilvl="0">
+      <w:startOverride w:val="1"/>
+    </w:lvlOverride>
+    <w:lvlOverride w:ilvl="1">
+      <w:startOverride w:val="1"/>
+    </w:lvlOverride>
+    <w:lvlOverride w:ilvl="2">
+      <w:startOverride w:val="1"/>
+    </w:lvlOverride>
+    <w:lvlOverride w:ilvl="3">
+      <w:startOverride w:val="1"/>
+    </w:lvlOverride>
+    <w:lvlOverride w:ilvl="4">
+      <w:startOverride w:val="1"/>
+    </w:lvlOverride>
+    <w:lvlOverride w:ilvl="5">
+      <w:startOverride w:val="1"/>
+    </w:lvlOverride>
+    <w:lvlOverride w:ilvl="6">
+      <w:startOverride w:val="1"/>
+    </w:lvlOverride>
+    <w:lvlOverride w:ilvl="7">
+      <w:startOverride w:val="1"/>
+    </w:lvlOverride>
+    <w:lvlOverride w:ilvl="8">
+      <w:startOverride w:val="1"/>
+    </w:lvlOverride>
+  </w:num>
+  <w:num w:numId="1019">
     <w:abstractNumId w:val="991"/>
   </w:num>
 </w:numbering>

</xml_diff>